<commit_message>
Add template and image formatting
</commit_message>
<xml_diff>
--- a/project-template.docx
+++ b/project-template.docx
@@ -4,6 +4,32 @@
   <w:body>
     <w:p>
       <w:pPr>
+        <w:rPr>
+          <w:color w:val="3c78d8"/>
+        </w:rPr>
+      </w:pPr>
+      <w:r>
+        <w:rPr>
+          <w:color w:val="3c78d8"/>
+          <w:rtl w:val="0"/>
+        </w:rPr>
+        <w:t xml:space="preserve">This template is designed to give each project a standard format; so be sure to fill out the “Summary” and “Tutorial” sections. Then you are free to add as many additional sections as best fits your project and what you wish to communicate about your learnings. </w:t>
+      </w:r>
+    </w:p>
+    <w:p>
+      <w:pPr>
+        <w:rPr>
+          <w:color w:val="3c78d8"/>
+        </w:rPr>
+      </w:pPr>
+      <w:r>
+        <w:rPr>
+          <w:rtl w:val="0"/>
+        </w:rPr>
+      </w:r>
+    </w:p>
+    <w:p>
+      <w:pPr>
         <w:rPr/>
       </w:pPr>
       <w:r>
@@ -11,7 +37,23 @@
           <w:color w:val="3c78d8"/>
           <w:rtl w:val="0"/>
         </w:rPr>
-        <w:t xml:space="preserve">This template is designed to give each project a standard format; so be sure to fill out the “Summary” and “Tutorial” sections. Then you are free to add as many additional sections as best fits your project and what you wish to communicate. Ensure you’ve removed all the instructions (blue text) before exporting and submitting!</w:t>
+        <w:t xml:space="preserve">Once you’re ready to submit, ensure you’ve removed all the instructions (blue text) before exporting as a </w:t>
+      </w:r>
+      <w:r>
+        <w:rPr>
+          <w:b w:val="1"/>
+          <w:bCs w:val="1"/>
+          <w:color w:val="3c78d8"/>
+          <w:rtl w:val="0"/>
+        </w:rPr>
+        <w:t xml:space="preserve">.docx</w:t>
+      </w:r>
+      <w:r>
+        <w:rPr>
+          <w:color w:val="3c78d8"/>
+          <w:rtl w:val="0"/>
+        </w:rPr>
+        <w:t xml:space="preserve"> file. Upload this .docx file to the TechShare Submit page in the “The write-up (.docx)” field. Thank you for your contribution!</w:t>
       </w:r>
       <w:r>
         <w:rPr>
@@ -30,7 +72,7 @@
         <w:rPr>
           <w:rtl w:val="0"/>
         </w:rPr>
-        <w:t xml:space="preserve">Tech Forum Project Template</w:t>
+        <w:t xml:space="preserve">Tech Forum Project Template (replace w/ a title)</w:t>
       </w:r>
     </w:p>
     <w:p>
@@ -100,7 +142,12 @@
         <w:rPr>
           <w:rtl w:val="0"/>
         </w:rPr>
-        <w:t xml:space="preserve">Takeaways (Optional)</w:t>
+        <w:t xml:space="preserve">Optional additional sections (Takeaways, Learnings, More About &lt;technology&gt;, Next Steps, etc.)</w:t>
+      </w:r>
+      <w:r>
+        <w:rPr>
+          <w:rtl w:val="0"/>
+        </w:rPr>
       </w:r>
     </w:p>
     <w:p>
@@ -112,7 +159,7 @@
           <w:color w:val="3c78d8"/>
           <w:rtl w:val="0"/>
         </w:rPr>
-        <w:t xml:space="preserve">This is an optional section for if there is anything further you’d like to share about your project, your learnings, and/or next steps. Feel free to rename it or delete it before submission.</w:t>
+        <w:t xml:space="preserve">Feel free to add additional sections if there is anything further you’d like to share about your project, your learnings, and/or next steps.</w:t>
       </w:r>
       <w:r>
         <w:rPr>

</xml_diff>